<commit_message>
Strengthen week 2 workflow contract checks
</commit_message>
<xml_diff>
--- a/05_week_2_memory/03_student_handout.docx
+++ b/05_week_2_memory/03_student_handout.docx
@@ -1807,7 +1807,7 @@
           <w:color w:val="13202A"/>
           <w:sz w:val="20"/>
         </w:rPr>
-        <w:t xml:space="preserve"> включает первую attempt;</w:t>
+        <w:t xml:space="preserve"> включает первое исполнение action;</w:t>
       </w:r>
     </w:p>
     <w:p>
@@ -1921,7 +1921,65 @@
           <w:color w:val="13202A"/>
           <w:sz w:val="20"/>
         </w:rPr>
-        <w:t>mapping/contract errors не повторяются.</w:t>
+        <w:t>mapping/contract errors не повторяются;</w:t>
+      </w:r>
+    </w:p>
+    <w:p>
+      <w:pPr>
+        <w:spacing w:after="60"/>
+        <w:ind w:left="397" w:hanging="238"/>
+      </w:pPr>
+      <w:r>
+        <w:rPr>
+          <w:rFonts w:ascii="Liberation Sans" w:hAnsi="Liberation Sans"/>
+          <w:b w:val="0"/>
+          <w:color w:val="13202A"/>
+          <w:sz w:val="20"/>
+        </w:rPr>
+        <w:t xml:space="preserve">• </w:t>
+      </w:r>
+      <w:r>
+        <w:rPr>
+          <w:rFonts w:ascii="Liberation Sans" w:hAnsi="Liberation Sans"/>
+          <w:b w:val="0"/>
+          <w:color w:val="13202A"/>
+          <w:sz w:val="20"/>
+        </w:rPr>
+        <w:t xml:space="preserve">истёкшая lease оставляет </w:t>
+      </w:r>
+      <w:r>
+        <w:rPr>
+          <w:rFonts w:ascii="Liberation Sans" w:hAnsi="Liberation Sans"/>
+          <w:color w:val="13202A"/>
+          <w:sz w:val="20"/>
+        </w:rPr>
+        <w:t>STALE</w:t>
+      </w:r>
+      <w:r>
+        <w:rPr>
+          <w:rFonts w:ascii="Liberation Sans" w:hAnsi="Liberation Sans"/>
+          <w:b w:val="0"/>
+          <w:color w:val="13202A"/>
+          <w:sz w:val="20"/>
+        </w:rPr>
+        <w:t xml:space="preserve"> attempt и увеличивает </w:t>
+      </w:r>
+      <w:r>
+        <w:rPr>
+          <w:rFonts w:ascii="Liberation Sans" w:hAnsi="Liberation Sans"/>
+          <w:color w:val="13202A"/>
+          <w:sz w:val="20"/>
+        </w:rPr>
+        <w:t>attempt_count</w:t>
+      </w:r>
+      <w:r>
+        <w:rPr>
+          <w:rFonts w:ascii="Liberation Sans" w:hAnsi="Liberation Sans"/>
+          <w:b w:val="0"/>
+          <w:color w:val="13202A"/>
+          <w:sz w:val="20"/>
+        </w:rPr>
+        <w:t>, но не расходует failure budget.</w:t>
       </w:r>
     </w:p>
     <w:p>
@@ -2339,6 +2397,85 @@
       </w:r>
     </w:p>
     <w:p>
+      <w:pPr/>
+      <w:r>
+        <w:rPr>
+          <w:b w:val="0"/>
+        </w:rPr>
+        <w:t xml:space="preserve">Роль </w:t>
+      </w:r>
+      <w:r>
+        <w:rPr>
+          <w:rFonts w:ascii="Liberation Mono" w:hAnsi="Liberation Mono"/>
+          <w:color w:val="9270D9"/>
+          <w:sz w:val="18"/>
+        </w:rPr>
+        <w:t>workflow_worker</w:t>
+      </w:r>
+      <w:r>
+        <w:rPr>
+          <w:b w:val="0"/>
+        </w:rPr>
+        <w:t xml:space="preserve"> выполняет только </w:t>
+      </w:r>
+      <w:r>
+        <w:rPr>
+          <w:rFonts w:ascii="Liberation Mono" w:hAnsi="Liberation Mono"/>
+          <w:color w:val="9270D9"/>
+          <w:sz w:val="18"/>
+        </w:rPr>
+        <w:t>workflow.claim_jobs</w:t>
+      </w:r>
+      <w:r>
+        <w:rPr>
+          <w:b w:val="0"/>
+        </w:rPr>
+        <w:t xml:space="preserve">, </w:t>
+      </w:r>
+      <w:r>
+        <w:rPr>
+          <w:rFonts w:ascii="Liberation Mono" w:hAnsi="Liberation Mono"/>
+          <w:color w:val="9270D9"/>
+          <w:sz w:val="18"/>
+        </w:rPr>
+        <w:t>api.invoke</w:t>
+      </w:r>
+      <w:r>
+        <w:rPr>
+          <w:b w:val="0"/>
+        </w:rPr>
+        <w:t xml:space="preserve">, </w:t>
+      </w:r>
+      <w:r>
+        <w:rPr>
+          <w:rFonts w:ascii="Liberation Mono" w:hAnsi="Liberation Mono"/>
+          <w:color w:val="9270D9"/>
+          <w:sz w:val="18"/>
+        </w:rPr>
+        <w:t>workflow.finish_job</w:t>
+      </w:r>
+      <w:r>
+        <w:rPr>
+          <w:b w:val="0"/>
+        </w:rPr>
+        <w:t xml:space="preserve">, </w:t>
+      </w:r>
+      <w:r>
+        <w:rPr>
+          <w:rFonts w:ascii="Liberation Mono" w:hAnsi="Liberation Mono"/>
+          <w:color w:val="9270D9"/>
+          <w:sz w:val="18"/>
+        </w:rPr>
+        <w:t>workflow.fail_job</w:t>
+      </w:r>
+      <w:r>
+        <w:rPr>
+          <w:b w:val="0"/>
+        </w:rPr>
+        <w:t>. Прямой DML и отдельное чтение action-каталога этой роли не нужны.</w:t>
+      </w:r>
+    </w:p>
+    <w:p>
       <w:pPr>
         <w:pStyle w:val="Heading2"/>
       </w:pPr>
@@ -2478,6 +2615,51 @@
           <w:b w:val="0"/>
         </w:rPr>
         <w:t>Stale worker не может завершить job после reclaim.</w:t>
+      </w:r>
+    </w:p>
+    <w:p>
+      <w:pPr/>
+      <w:r>
+        <w:rPr>
+          <w:rFonts w:ascii="Liberation Mono" w:hAnsi="Liberation Mono"/>
+          <w:color w:val="9270D9"/>
+          <w:sz w:val="18"/>
+        </w:rPr>
+        <w:t>message-id</w:t>
+      </w:r>
+      <w:r>
+        <w:rPr>
+          <w:b w:val="0"/>
+        </w:rPr>
+        <w:t xml:space="preserve"> сигнала глобально уникален. Ранний сигнал объявленного pinned map типа сохраняется как </w:t>
+      </w:r>
+      <w:r>
+        <w:rPr>
+          <w:rFonts w:ascii="Liberation Mono" w:hAnsi="Liberation Mono"/>
+          <w:color w:val="9270D9"/>
+          <w:sz w:val="18"/>
+        </w:rPr>
+        <w:t>ACCEPTED</w:t>
+      </w:r>
+      <w:r>
+        <w:rPr>
+          <w:b w:val="0"/>
+        </w:rPr>
+        <w:t xml:space="preserve"> и применяется при входе в соответствующий </w:t>
+      </w:r>
+      <w:r>
+        <w:rPr>
+          <w:rFonts w:ascii="Liberation Mono" w:hAnsi="Liberation Mono"/>
+          <w:color w:val="9270D9"/>
+          <w:sz w:val="18"/>
+        </w:rPr>
+        <w:t>wait_signal</w:t>
+      </w:r>
+      <w:r>
+        <w:rPr>
+          <w:b w:val="0"/>
+        </w:rPr>
+        <w:t>.</w:t>
       </w:r>
     </w:p>
     <w:p>

</xml_diff>